<commit_message>
Use BeagleConnect product names consistently
</commit_message>
<xml_diff>
--- a/documentation/BeagleConnect-Torque-Features-and-Description.docx
+++ b/documentation/BeagleConnect-Torque-Features-and-Description.docx
@@ -28,7 +28,7 @@
     </w:p>
     <w:p>
       <w:r>
-        <w:t>BeagleConnect Torque is a small processor module for motor control, motion control, and CAN-based sensing, actuating, controlling, or display embedded designs. It features a Texas Instruments (TI) AM13E23019 Arm Cortex-M33 running at 200 MHz, 512 KB flash, 128 KB SRAM, a TinyEngine edge-AI accelerator (NPU) for application-specific local inference, a trigonometric math unit (TMU), and hardware security features. BeagleConnect Torque serves as the central controller inside BeagleConnect Quad ESC (a 4-in-1 brushless DC motor electronic speed controller) and is intended as a standalone solder-down module for high-volume production, rapid prototyping, and custom carrier board development. Hardware schematics, layout, and firmware are open source.</w:t>
+        <w:t>BeagleConnect Torque is a small processor module for motor control, motion control, and CAN-based sensing, actuating, controlling, or display embedded designs. It features a Texas Instruments (TI) AM13E23019 Arm Cortex-M33 running at 200 MHz, 512 KB flash, 128 KB SRAM, a TinyEngine edge-AI accelerator (NPU) for application-specific local inference, a trigonometric math unit (TMU), and hardware security features. BeagleConnect Torque serves as the central controller inside BeagleConnect QuadESC (a 4-in-1 brushless DC motor electronic speed controller) and is intended as a standalone solder-down module for high-volume production, rapid prototyping, and custom carrier board development. Hardware schematics, layout, and firmware are open source.</w:t>
       </w:r>
     </w:p>
     <w:p>
@@ -49,7 +49,7 @@
         <w:pStyle w:val="ListBullet"/>
       </w:pPr>
       <w:r>
-        <w:t>Drone electronic speed controllers, including the four-channel BeagleConnect QuadESC carrier.</w:t>
+        <w:t>Drone electronic speed controllers, including BeagleConnect QuadESC as a four-channel carrier.</w:t>
       </w:r>
     </w:p>
     <w:p>
@@ -102,7 +102,7 @@
     </w:p>
     <w:p>
       <w:r>
-        <w:t>Firmware sources are available in the QuadESC repository. Load custom firmware through Serial Wire Debug (SWD) or the TI ROM bootstrap loader (BSL) over CAN, I²C or UART. J2 provides SWDIO, SWCLK, UART, reset and boot-invoke signals.</w:t>
+        <w:t>Firmware sources are available in BeagleConnect QuadESC repository. Load custom firmware through Serial Wire Debug (SWD) or the TI ROM bootstrap loader (BSL) over CAN, I²C or UART. J2 provides SWDIO, SWCLK, UART, reset and boot-invoke signals.</w:t>
       </w:r>
     </w:p>
     <w:p>
@@ -140,7 +140,7 @@
     </w:p>
     <w:p>
       <w:r>
-        <w:t>A reusable controller for four QuadESC motor channels, with onboard CAN hardware, expansion connections and a solder-down carrier interface. Motor gate drivers and power transistors are on the carrier.</w:t>
+        <w:t>A reusable controller for four BeagleConnect QuadESC motor channels, with onboard CAN hardware, expansion connections and a solder-down carrier interface. Motor gate drivers and power transistors are on the carrier.</w:t>
       </w:r>
     </w:p>
     <w:tbl>
@@ -444,7 +444,7 @@
               <w:rPr>
                 <w:sz w:val="18"/>
               </w:rPr>
-              <w:t>Controller for up to four three-phase motor channels on QuadESC; external power stages and application firmware required</w:t>
+              <w:t>Controller for up to four three-phase motor channels on BeagleConnect QuadESC; external power stages and application firmware required</w:t>
             </w:r>
           </w:p>
         </w:tc>

</xml_diff>